<commit_message>
Mark Sprints 13-14 delivered in the backlog and Word documents
Co-Authored-By: Claude Opus 5.5 <noreply@anthropic.com>
</commit_message>
<xml_diff>
--- a/Product_Backlog.docx
+++ b/Product_Backlog.docx
@@ -15728,7 +15728,7 @@
           <w:sz w:val="21"/>
           <w:szCs w:val="21"/>
         </w:rPr>
-        <w:t xml:space="preserve">Status: Planned</w:t>
+        <w:t xml:space="preserve">Status: Delivered</w:t>
       </w:r>
     </w:p>
     <w:tbl>
@@ -16803,7 +16803,7 @@
           <w:sz w:val="21"/>
           <w:szCs w:val="21"/>
         </w:rPr>
-        <w:t xml:space="preserve">Status: Planned</w:t>
+        <w:t xml:space="preserve">Status: Delivered</w:t>
       </w:r>
     </w:p>
     <w:tbl>

</xml_diff>